<commit_message>
cambios de features en español y correciones de tags para ST
</commit_message>
<xml_diff>
--- a/ruta/EXXO.docx
+++ b/ruta/EXXO.docx
@@ -44,7 +44,7 @@
           </w:tcPr>
           <w:p>
             <w:r>
-              <w:t>ID ESCENARIO</w:t>
+              <w:t>FEATURE</w:t>
             </w:r>
           </w:p>
         </w:tc>
@@ -66,7 +66,7 @@
                 <w:color w:val="000000"/>
                 <w:sz w:val="20"/>
               </w:rPr>
-              <w:t>EXXO_</w:t>
+              <w:t>{{FEATURE}}</w:t>
             </w:r>
           </w:p>
         </w:tc>
@@ -122,42 +122,6 @@
                 <w:bCs/>
               </w:rPr>
               <w:t>{{CONCLUSION}}</w:t>
-            </w:r>
-          </w:p>
-        </w:tc>
-      </w:tr>
-      <w:tr>
-        <w:tc>
-          <w:tcPr>
-            <w:tcW w:w="2830" w:type="dxa"/>
-            <w:shd w:val="clear" w:color="auto" w:fill="C00000"/>
-          </w:tcPr>
-          <w:p>
-            <w:r>
-              <w:t xml:space="preserve">LINEA Y PLAN </w:t>
-            </w:r>
-            <w:r>
-              <w:tab/>
-            </w:r>
-          </w:p>
-        </w:tc>
-        <w:tc>
-          <w:tcPr>
-            <w:tcW w:w="7960" w:type="dxa"/>
-          </w:tcPr>
-          <w:p>
-            <w:pPr>
-              <w:rPr>
-                <w:rFonts w:ascii="Calibri" w:hAnsi="Calibri" w:cs="Calibri"/>
-                <w:color w:val="000000"/>
-              </w:rPr>
-            </w:pPr>
-            <w:r>
-              <w:rPr>
-                <w:rFonts w:ascii="Calibri" w:hAnsi="Calibri" w:cs="Calibri"/>
-                <w:color w:val="000000"/>
-              </w:rPr>
-              <w:t>{{LINEA}}</w:t>
             </w:r>
           </w:p>
         </w:tc>

</xml_diff>